<commit_message>
docs: Cap nhat so dong trong PhanQuyenNhanSu.docx
</commit_message>
<xml_diff>
--- a/PhanQuyenNhanSu.docx
+++ b/PhanQuyenNhanSu.docx
@@ -170,7 +170,7 @@
           <w:b/>
           <w:sz w:val="26"/>
         </w:rPr>
-        <w:t>1.2. Khởi tạo vai trò và ánh xạ dữ liệu (Dòng 15 - 39 trong PhanQuyenNhanSu.jsx)</w:t>
+        <w:t>1.2. Khởi tạo vai trò và ánh xạ dữ liệu (Dòng 15 - 40 trong PhanQuyenNhanSu.jsx)</w:t>
       </w:r>
     </w:p>
     <w:p>
@@ -1270,7 +1270,7 @@
           <w:b/>
           <w:sz w:val="26"/>
         </w:rPr>
-        <w:t>3.1. Hàm tải danh sách nhân sự loadStaffList (Dòng 96 - 113)</w:t>
+        <w:t>3.1. Hàm tải danh sách nhân sự loadStaffList (Dòng 116 - 133)</w:t>
       </w:r>
     </w:p>
     <w:p>
@@ -1610,7 +1610,7 @@
           <w:b/>
           <w:sz w:val="26"/>
         </w:rPr>
-        <w:t>3.2. Hàm lưu dữ liệu nhân viên handleSave (Dòng 206 - 282)</w:t>
+        <w:t>3.2. Hàm lưu dữ liệu nhân viên handleSave (Dòng 227 - 305)</w:t>
       </w:r>
     </w:p>
     <w:p>
@@ -1916,6 +1916,22 @@
           <w:rFonts w:ascii="Courier New" w:hAnsi="Courier New" w:cs="Courier New"/>
           <w:sz w:val="20"/>
         </w:rPr>
+        <w:t xml:space="preserve">    maKhoa: formData.maKhoa?.trim() || null,</w:t>
+      </w:r>
+    </w:p>
+    <w:p>
+      <w:pPr>
+        <w:spacing w:after="80" w:line="240" w:lineRule="auto"/>
+        <w:rPr>
+          <w:rFonts w:ascii="Courier New" w:hAnsi="Courier New" w:cs="Courier New"/>
+          <w:sz w:val="20"/>
+        </w:rPr>
+      </w:pPr>
+      <w:r>
+        <w:rPr>
+          <w:rFonts w:ascii="Courier New" w:hAnsi="Courier New" w:cs="Courier New"/>
+          <w:sz w:val="20"/>
+        </w:rPr>
         <w:t xml:space="preserve">    username: formData.email.trim(),</w:t>
       </w:r>
     </w:p>
@@ -2140,6 +2156,22 @@
           <w:rFonts w:ascii="Courier New" w:hAnsi="Courier New" w:cs="Courier New"/>
           <w:sz w:val="20"/>
         </w:rPr>
+        <w:t xml:space="preserve">    maKhoa: formData.maKhoa?.trim() || null,</w:t>
+      </w:r>
+    </w:p>
+    <w:p>
+      <w:pPr>
+        <w:spacing w:after="80" w:line="240" w:lineRule="auto"/>
+        <w:rPr>
+          <w:rFonts w:ascii="Courier New" w:hAnsi="Courier New" w:cs="Courier New"/>
+          <w:sz w:val="20"/>
+        </w:rPr>
+      </w:pPr>
+      <w:r>
+        <w:rPr>
+          <w:rFonts w:ascii="Courier New" w:hAnsi="Courier New" w:cs="Courier New"/>
+          <w:sz w:val="20"/>
+        </w:rPr>
         <w:t xml:space="preserve">    username: formData.email.trim(),</w:t>
       </w:r>
     </w:p>
@@ -2270,7 +2302,7 @@
           <w:b/>
           <w:sz w:val="26"/>
         </w:rPr>
-        <w:t>3.3. Hàm xóa nhân sự handleDeleteStaff (Dòng 287 - 330)</w:t>
+        <w:t>3.3. Hàm xóa nhân sự handleDeleteStaff (Dòng 310 - 354)</w:t>
       </w:r>
     </w:p>
     <w:p>
@@ -2591,7 +2623,23 @@
           <w:rFonts w:ascii="Courier New" w:hAnsi="Courier New" w:cs="Courier New"/>
           <w:sz w:val="20"/>
         </w:rPr>
-        <w:t xml:space="preserve">                chuyenMon: null, username: staffToLock.username, password: null,</w:t>
+        <w:t xml:space="preserve">                chuyenMon: staffToLock.chuyenMon || null, maKhoa: staffToLock.maKhoa || null,</w:t>
+      </w:r>
+    </w:p>
+    <w:p>
+      <w:pPr>
+        <w:spacing w:after="80" w:line="240" w:lineRule="auto"/>
+        <w:rPr>
+          <w:rFonts w:ascii="Courier New" w:hAnsi="Courier New" w:cs="Courier New"/>
+          <w:sz w:val="20"/>
+        </w:rPr>
+      </w:pPr>
+      <w:r>
+        <w:rPr>
+          <w:rFonts w:ascii="Courier New" w:hAnsi="Courier New" w:cs="Courier New"/>
+          <w:sz w:val="20"/>
+        </w:rPr>
+        <w:t xml:space="preserve">                username: staffToLock.username, password: null,</w:t>
       </w:r>
     </w:p>
     <w:p>
@@ -2898,7 +2946,7 @@
           <w:b/>
           <w:sz w:val="26"/>
         </w:rPr>
-        <w:t>3.4. Hàm reset mật khẩu về mặc định handleResetToDefaultPassword (Dòng 335 - 340)</w:t>
+        <w:t>3.4. Hàm reset mật khẩu về mặc định handleResetToDefaultPassword (Dòng 359 - 364)</w:t>
       </w:r>
     </w:p>
     <w:p>
@@ -3867,7 +3915,7 @@
     <w:link w:val="Heading1Char"/>
     <w:uiPriority w:val="9"/>
     <w:qFormat/>
-    <w:rsid w:val="00C90AE6"/>
+    <w:rsid w:val="002E7CD9"/>
     <w:pPr>
       <w:keepNext/>
       <w:keepLines/>
@@ -3890,7 +3938,7 @@
     <w:semiHidden/>
     <w:unhideWhenUsed/>
     <w:qFormat/>
-    <w:rsid w:val="00C90AE6"/>
+    <w:rsid w:val="002E7CD9"/>
     <w:pPr>
       <w:keepNext/>
       <w:keepLines/>
@@ -3913,7 +3961,7 @@
     <w:semiHidden/>
     <w:unhideWhenUsed/>
     <w:qFormat/>
-    <w:rsid w:val="00C90AE6"/>
+    <w:rsid w:val="002E7CD9"/>
     <w:pPr>
       <w:keepNext/>
       <w:keepLines/>
@@ -3936,7 +3984,7 @@
     <w:semiHidden/>
     <w:unhideWhenUsed/>
     <w:qFormat/>
-    <w:rsid w:val="00C90AE6"/>
+    <w:rsid w:val="002E7CD9"/>
     <w:pPr>
       <w:keepNext/>
       <w:keepLines/>
@@ -3959,7 +4007,7 @@
     <w:semiHidden/>
     <w:unhideWhenUsed/>
     <w:qFormat/>
-    <w:rsid w:val="00C90AE6"/>
+    <w:rsid w:val="002E7CD9"/>
     <w:pPr>
       <w:keepNext/>
       <w:keepLines/>
@@ -3980,7 +4028,7 @@
     <w:semiHidden/>
     <w:unhideWhenUsed/>
     <w:qFormat/>
-    <w:rsid w:val="00C90AE6"/>
+    <w:rsid w:val="002E7CD9"/>
     <w:pPr>
       <w:keepNext/>
       <w:keepLines/>
@@ -4003,7 +4051,7 @@
     <w:semiHidden/>
     <w:unhideWhenUsed/>
     <w:qFormat/>
-    <w:rsid w:val="00C90AE6"/>
+    <w:rsid w:val="002E7CD9"/>
     <w:pPr>
       <w:keepNext/>
       <w:keepLines/>
@@ -4024,7 +4072,7 @@
     <w:semiHidden/>
     <w:unhideWhenUsed/>
     <w:qFormat/>
-    <w:rsid w:val="00C90AE6"/>
+    <w:rsid w:val="002E7CD9"/>
     <w:pPr>
       <w:keepNext/>
       <w:keepLines/>
@@ -4047,7 +4095,7 @@
     <w:semiHidden/>
     <w:unhideWhenUsed/>
     <w:qFormat/>
-    <w:rsid w:val="00C90AE6"/>
+    <w:rsid w:val="002E7CD9"/>
     <w:pPr>
       <w:keepNext/>
       <w:keepLines/>
@@ -4091,7 +4139,7 @@
     <w:basedOn w:val="DefaultParagraphFont"/>
     <w:link w:val="Heading1"/>
     <w:uiPriority w:val="9"/>
-    <w:rsid w:val="00C90AE6"/>
+    <w:rsid w:val="002E7CD9"/>
     <w:rPr>
       <w:rFonts w:asciiTheme="majorHAnsi" w:eastAsiaTheme="majorEastAsia" w:hAnsiTheme="majorHAnsi" w:cstheme="majorBidi"/>
       <w:color w:val="0F4761" w:themeColor="accent1" w:themeShade="BF"/>
@@ -4105,7 +4153,7 @@
     <w:link w:val="Heading2"/>
     <w:uiPriority w:val="9"/>
     <w:semiHidden/>
-    <w:rsid w:val="00C90AE6"/>
+    <w:rsid w:val="002E7CD9"/>
     <w:rPr>
       <w:rFonts w:asciiTheme="majorHAnsi" w:eastAsiaTheme="majorEastAsia" w:hAnsiTheme="majorHAnsi" w:cstheme="majorBidi"/>
       <w:color w:val="0F4761" w:themeColor="accent1" w:themeShade="BF"/>
@@ -4119,7 +4167,7 @@
     <w:link w:val="Heading3"/>
     <w:uiPriority w:val="9"/>
     <w:semiHidden/>
-    <w:rsid w:val="00C90AE6"/>
+    <w:rsid w:val="002E7CD9"/>
     <w:rPr>
       <w:rFonts w:eastAsiaTheme="majorEastAsia" w:cstheme="majorBidi"/>
       <w:color w:val="0F4761" w:themeColor="accent1" w:themeShade="BF"/>
@@ -4133,7 +4181,7 @@
     <w:link w:val="Heading4"/>
     <w:uiPriority w:val="9"/>
     <w:semiHidden/>
-    <w:rsid w:val="00C90AE6"/>
+    <w:rsid w:val="002E7CD9"/>
     <w:rPr>
       <w:rFonts w:eastAsiaTheme="majorEastAsia" w:cstheme="majorBidi"/>
       <w:i/>
@@ -4147,7 +4195,7 @@
     <w:link w:val="Heading5"/>
     <w:uiPriority w:val="9"/>
     <w:semiHidden/>
-    <w:rsid w:val="00C90AE6"/>
+    <w:rsid w:val="002E7CD9"/>
     <w:rPr>
       <w:rFonts w:eastAsiaTheme="majorEastAsia" w:cstheme="majorBidi"/>
       <w:color w:val="0F4761" w:themeColor="accent1" w:themeShade="BF"/>
@@ -4159,7 +4207,7 @@
     <w:link w:val="Heading6"/>
     <w:uiPriority w:val="9"/>
     <w:semiHidden/>
-    <w:rsid w:val="00C90AE6"/>
+    <w:rsid w:val="002E7CD9"/>
     <w:rPr>
       <w:rFonts w:eastAsiaTheme="majorEastAsia" w:cstheme="majorBidi"/>
       <w:i/>
@@ -4173,7 +4221,7 @@
     <w:link w:val="Heading7"/>
     <w:uiPriority w:val="9"/>
     <w:semiHidden/>
-    <w:rsid w:val="00C90AE6"/>
+    <w:rsid w:val="002E7CD9"/>
     <w:rPr>
       <w:rFonts w:eastAsiaTheme="majorEastAsia" w:cstheme="majorBidi"/>
       <w:color w:val="595959" w:themeColor="text1" w:themeTint="A6"/>
@@ -4185,7 +4233,7 @@
     <w:link w:val="Heading8"/>
     <w:uiPriority w:val="9"/>
     <w:semiHidden/>
-    <w:rsid w:val="00C90AE6"/>
+    <w:rsid w:val="002E7CD9"/>
     <w:rPr>
       <w:rFonts w:eastAsiaTheme="majorEastAsia" w:cstheme="majorBidi"/>
       <w:i/>
@@ -4199,7 +4247,7 @@
     <w:link w:val="Heading9"/>
     <w:uiPriority w:val="9"/>
     <w:semiHidden/>
-    <w:rsid w:val="00C90AE6"/>
+    <w:rsid w:val="002E7CD9"/>
     <w:rPr>
       <w:rFonts w:eastAsiaTheme="majorEastAsia" w:cstheme="majorBidi"/>
       <w:color w:val="272727" w:themeColor="text1" w:themeTint="D8"/>
@@ -4212,7 +4260,7 @@
     <w:link w:val="TitleChar"/>
     <w:uiPriority w:val="10"/>
     <w:qFormat/>
-    <w:rsid w:val="00C90AE6"/>
+    <w:rsid w:val="002E7CD9"/>
     <w:pPr>
       <w:spacing w:after="80" w:line="240" w:lineRule="auto"/>
       <w:contextualSpacing/>
@@ -4230,7 +4278,7 @@
     <w:basedOn w:val="DefaultParagraphFont"/>
     <w:link w:val="Title"/>
     <w:uiPriority w:val="10"/>
-    <w:rsid w:val="00C90AE6"/>
+    <w:rsid w:val="002E7CD9"/>
     <w:rPr>
       <w:rFonts w:asciiTheme="majorHAnsi" w:eastAsiaTheme="majorEastAsia" w:hAnsiTheme="majorHAnsi" w:cstheme="majorBidi"/>
       <w:spacing w:val="-10"/>
@@ -4246,7 +4294,7 @@
     <w:link w:val="SubtitleChar"/>
     <w:uiPriority w:val="11"/>
     <w:qFormat/>
-    <w:rsid w:val="00C90AE6"/>
+    <w:rsid w:val="002E7CD9"/>
     <w:pPr>
       <w:numPr>
         <w:ilvl w:val="1"/>
@@ -4265,7 +4313,7 @@
     <w:basedOn w:val="DefaultParagraphFont"/>
     <w:link w:val="Subtitle"/>
     <w:uiPriority w:val="11"/>
-    <w:rsid w:val="00C90AE6"/>
+    <w:rsid w:val="002E7CD9"/>
     <w:rPr>
       <w:rFonts w:eastAsiaTheme="majorEastAsia" w:cstheme="majorBidi"/>
       <w:color w:val="595959" w:themeColor="text1" w:themeTint="A6"/>
@@ -4281,7 +4329,7 @@
     <w:link w:val="QuoteChar"/>
     <w:uiPriority w:val="29"/>
     <w:qFormat/>
-    <w:rsid w:val="00C90AE6"/>
+    <w:rsid w:val="002E7CD9"/>
     <w:pPr>
       <w:spacing w:before="160"/>
       <w:jc w:val="center"/>
@@ -4297,7 +4345,7 @@
     <w:basedOn w:val="DefaultParagraphFont"/>
     <w:link w:val="Quote"/>
     <w:uiPriority w:val="29"/>
-    <w:rsid w:val="00C90AE6"/>
+    <w:rsid w:val="002E7CD9"/>
     <w:rPr>
       <w:i/>
       <w:iCs/>
@@ -4309,7 +4357,7 @@
     <w:basedOn w:val="Normal"/>
     <w:uiPriority w:val="34"/>
     <w:qFormat/>
-    <w:rsid w:val="00C90AE6"/>
+    <w:rsid w:val="002E7CD9"/>
     <w:pPr>
       <w:ind w:left="720"/>
       <w:contextualSpacing/>
@@ -4320,7 +4368,7 @@
     <w:basedOn w:val="DefaultParagraphFont"/>
     <w:uiPriority w:val="21"/>
     <w:qFormat/>
-    <w:rsid w:val="00C90AE6"/>
+    <w:rsid w:val="002E7CD9"/>
     <w:rPr>
       <w:i/>
       <w:iCs/>
@@ -4334,7 +4382,7 @@
     <w:link w:val="IntenseQuoteChar"/>
     <w:uiPriority w:val="30"/>
     <w:qFormat/>
-    <w:rsid w:val="00C90AE6"/>
+    <w:rsid w:val="002E7CD9"/>
     <w:pPr>
       <w:pBdr>
         <w:top w:val="single" w:sz="4" w:space="10" w:color="0F4761" w:themeColor="accent1" w:themeShade="BF"/>
@@ -4355,7 +4403,7 @@
     <w:basedOn w:val="DefaultParagraphFont"/>
     <w:link w:val="IntenseQuote"/>
     <w:uiPriority w:val="30"/>
-    <w:rsid w:val="00C90AE6"/>
+    <w:rsid w:val="002E7CD9"/>
     <w:rPr>
       <w:i/>
       <w:iCs/>
@@ -4367,7 +4415,7 @@
     <w:basedOn w:val="DefaultParagraphFont"/>
     <w:uiPriority w:val="32"/>
     <w:qFormat/>
-    <w:rsid w:val="00C90AE6"/>
+    <w:rsid w:val="002E7CD9"/>
     <w:rPr>
       <w:b/>
       <w:bCs/>

</xml_diff>